<commit_message>
Updated Appraisal Sheet Forms
</commit_message>
<xml_diff>
--- a/templates_docx/Appraisal_Sheet_BLIS.docx
+++ b/templates_docx/Appraisal_Sheet_BLIS.docx
@@ -2067,7 +2067,6 @@
     <w:tbl>
       <w:tblPr>
         <w:tblStyle w:val="TableGrid"/>
-        <w:tblpPr w:leftFromText="180" w:rightFromText="180" w:vertAnchor="text" w:horzAnchor="margin" w:tblpY="332"/>
         <w:tblW w:w="0" w:type="auto"/>
         <w:tblLook w:val="04A0" w:firstRow="1" w:lastRow="0" w:firstColumn="1" w:lastColumn="0" w:noHBand="0" w:noVBand="1"/>
       </w:tblPr>
@@ -3813,7 +3812,6 @@
     <w:tbl>
       <w:tblPr>
         <w:tblStyle w:val="TableGrid"/>
-        <w:tblpPr w:leftFromText="180" w:rightFromText="180" w:vertAnchor="text" w:horzAnchor="margin" w:tblpY="296"/>
         <w:tblW w:w="0" w:type="auto"/>
         <w:tblLook w:val="04A0" w:firstRow="1" w:lastRow="0" w:firstColumn="1" w:lastColumn="0" w:noHBand="0" w:noVBand="1"/>
       </w:tblPr>
@@ -5569,7 +5567,6 @@
     <w:tbl>
       <w:tblPr>
         <w:tblStyle w:val="TableGrid"/>
-        <w:tblpPr w:leftFromText="180" w:rightFromText="180" w:vertAnchor="text" w:horzAnchor="margin" w:tblpY="322"/>
         <w:tblW w:w="0" w:type="auto"/>
         <w:tblLook w:val="04A0" w:firstRow="1" w:lastRow="0" w:firstColumn="1" w:lastColumn="0" w:noHBand="0" w:noVBand="1"/>
       </w:tblPr>
@@ -7302,7 +7299,6 @@
     <w:tbl>
       <w:tblPr>
         <w:tblStyle w:val="TableGrid"/>
-        <w:tblpPr w:leftFromText="180" w:rightFromText="180" w:vertAnchor="text" w:horzAnchor="margin" w:tblpY="296"/>
         <w:tblW w:w="0" w:type="auto"/>
         <w:tblLook w:val="04A0" w:firstRow="1" w:lastRow="0" w:firstColumn="1" w:lastColumn="0" w:noHBand="0" w:noVBand="1"/>
       </w:tblPr>
@@ -9019,7 +9015,6 @@
     <w:tbl>
       <w:tblPr>
         <w:tblStyle w:val="TableGrid"/>
-        <w:tblpPr w:leftFromText="180" w:rightFromText="180" w:vertAnchor="text" w:horzAnchor="margin" w:tblpY="322"/>
         <w:tblW w:w="0" w:type="auto"/>
         <w:tblLook w:val="04A0" w:firstRow="1" w:lastRow="0" w:firstColumn="1" w:lastColumn="0" w:noHBand="0" w:noVBand="1"/>
       </w:tblPr>
@@ -10752,7 +10747,6 @@
     <w:tbl>
       <w:tblPr>
         <w:tblStyle w:val="TableGrid"/>
-        <w:tblpPr w:leftFromText="180" w:rightFromText="180" w:vertAnchor="text" w:horzAnchor="margin" w:tblpY="296"/>
         <w:tblW w:w="0" w:type="auto"/>
         <w:tblLook w:val="04A0" w:firstRow="1" w:lastRow="0" w:firstColumn="1" w:lastColumn="0" w:noHBand="0" w:noVBand="1"/>
       </w:tblPr>
@@ -11597,7 +11591,6 @@
     <w:tbl>
       <w:tblPr>
         <w:tblStyle w:val="TableGrid"/>
-        <w:tblpPr w:leftFromText="180" w:rightFromText="180" w:vertAnchor="text" w:horzAnchor="margin" w:tblpY="296"/>
         <w:tblW w:w="0" w:type="auto"/>
         <w:tblLook w:val="04A0" w:firstRow="1" w:lastRow="0" w:firstColumn="1" w:lastColumn="0" w:noHBand="0" w:noVBand="1"/>
       </w:tblPr>
@@ -12425,7 +12418,6 @@
     <w:tbl>
       <w:tblPr>
         <w:tblStyle w:val="TableGrid"/>
-        <w:tblpPr w:leftFromText="180" w:rightFromText="180" w:vertAnchor="text" w:horzAnchor="margin" w:tblpY="322"/>
         <w:tblW w:w="0" w:type="auto"/>
         <w:tblLook w:val="04A0" w:firstRow="1" w:lastRow="0" w:firstColumn="1" w:lastColumn="0" w:noHBand="0" w:noVBand="1"/>
       </w:tblPr>

</xml_diff>

<commit_message>
Revert "Updated Appraisal Sheet Forms"
This reverts commit 5adb6f07a099dce63b279255d0ab7b5a0b1a8596.
</commit_message>
<xml_diff>
--- a/templates_docx/Appraisal_Sheet_BLIS.docx
+++ b/templates_docx/Appraisal_Sheet_BLIS.docx
@@ -2067,6 +2067,7 @@
     <w:tbl>
       <w:tblPr>
         <w:tblStyle w:val="TableGrid"/>
+        <w:tblpPr w:leftFromText="180" w:rightFromText="180" w:vertAnchor="text" w:horzAnchor="margin" w:tblpY="332"/>
         <w:tblW w:w="0" w:type="auto"/>
         <w:tblLook w:val="04A0" w:firstRow="1" w:lastRow="0" w:firstColumn="1" w:lastColumn="0" w:noHBand="0" w:noVBand="1"/>
       </w:tblPr>
@@ -3812,6 +3813,7 @@
     <w:tbl>
       <w:tblPr>
         <w:tblStyle w:val="TableGrid"/>
+        <w:tblpPr w:leftFromText="180" w:rightFromText="180" w:vertAnchor="text" w:horzAnchor="margin" w:tblpY="296"/>
         <w:tblW w:w="0" w:type="auto"/>
         <w:tblLook w:val="04A0" w:firstRow="1" w:lastRow="0" w:firstColumn="1" w:lastColumn="0" w:noHBand="0" w:noVBand="1"/>
       </w:tblPr>
@@ -5567,6 +5569,7 @@
     <w:tbl>
       <w:tblPr>
         <w:tblStyle w:val="TableGrid"/>
+        <w:tblpPr w:leftFromText="180" w:rightFromText="180" w:vertAnchor="text" w:horzAnchor="margin" w:tblpY="322"/>
         <w:tblW w:w="0" w:type="auto"/>
         <w:tblLook w:val="04A0" w:firstRow="1" w:lastRow="0" w:firstColumn="1" w:lastColumn="0" w:noHBand="0" w:noVBand="1"/>
       </w:tblPr>
@@ -7299,6 +7302,7 @@
     <w:tbl>
       <w:tblPr>
         <w:tblStyle w:val="TableGrid"/>
+        <w:tblpPr w:leftFromText="180" w:rightFromText="180" w:vertAnchor="text" w:horzAnchor="margin" w:tblpY="296"/>
         <w:tblW w:w="0" w:type="auto"/>
         <w:tblLook w:val="04A0" w:firstRow="1" w:lastRow="0" w:firstColumn="1" w:lastColumn="0" w:noHBand="0" w:noVBand="1"/>
       </w:tblPr>
@@ -9015,6 +9019,7 @@
     <w:tbl>
       <w:tblPr>
         <w:tblStyle w:val="TableGrid"/>
+        <w:tblpPr w:leftFromText="180" w:rightFromText="180" w:vertAnchor="text" w:horzAnchor="margin" w:tblpY="322"/>
         <w:tblW w:w="0" w:type="auto"/>
         <w:tblLook w:val="04A0" w:firstRow="1" w:lastRow="0" w:firstColumn="1" w:lastColumn="0" w:noHBand="0" w:noVBand="1"/>
       </w:tblPr>
@@ -10747,6 +10752,7 @@
     <w:tbl>
       <w:tblPr>
         <w:tblStyle w:val="TableGrid"/>
+        <w:tblpPr w:leftFromText="180" w:rightFromText="180" w:vertAnchor="text" w:horzAnchor="margin" w:tblpY="296"/>
         <w:tblW w:w="0" w:type="auto"/>
         <w:tblLook w:val="04A0" w:firstRow="1" w:lastRow="0" w:firstColumn="1" w:lastColumn="0" w:noHBand="0" w:noVBand="1"/>
       </w:tblPr>
@@ -11591,6 +11597,7 @@
     <w:tbl>
       <w:tblPr>
         <w:tblStyle w:val="TableGrid"/>
+        <w:tblpPr w:leftFromText="180" w:rightFromText="180" w:vertAnchor="text" w:horzAnchor="margin" w:tblpY="296"/>
         <w:tblW w:w="0" w:type="auto"/>
         <w:tblLook w:val="04A0" w:firstRow="1" w:lastRow="0" w:firstColumn="1" w:lastColumn="0" w:noHBand="0" w:noVBand="1"/>
       </w:tblPr>
@@ -12418,6 +12425,7 @@
     <w:tbl>
       <w:tblPr>
         <w:tblStyle w:val="TableGrid"/>
+        <w:tblpPr w:leftFromText="180" w:rightFromText="180" w:vertAnchor="text" w:horzAnchor="margin" w:tblpY="322"/>
         <w:tblW w:w="0" w:type="auto"/>
         <w:tblLook w:val="04A0" w:firstRow="1" w:lastRow="0" w:firstColumn="1" w:lastColumn="0" w:noHBand="0" w:noVBand="1"/>
       </w:tblPr>

</xml_diff>